<commit_message>
Add full analysis pipeline, outputs, and final deliverables
- analysis/: compute_metrics.py, statistical_analysis.py, placebo_tests.py, visualizations.py
- outputs/: portfolio_metrics, sector_weights, descriptive_stats, treatment_effects, regression_results, placebo (permutation + within-control), sensitivity_trimmed
- reports/: report.tex, report.pdf, figures/, presentation.pptx, build_presentation.py
- Updated README with repo layout, pipeline instructions, and key results table
</commit_message>
<xml_diff>
--- a/LLM_Portfolio_Project_Checklist.docx
+++ b/LLM_Portfolio_Project_Checklist.docx
@@ -1083,10 +1083,7 @@
       </w:r>
       <w:proofErr w:type="gramStart"/>
       <w:r>
-        <w:t>exclusion</w:t>
-      </w:r>
-      <w:r>
-        <w:t xml:space="preserve"> :</w:t>
+        <w:t>exclusion :</w:t>
       </w:r>
       <w:proofErr w:type="gramEnd"/>
       <w:r>
@@ -1782,13 +1779,7 @@
         <w:rPr>
           <w:rFonts w:ascii="Segoe UI Symbol" w:eastAsia="Segoe UI Symbol" w:hAnsi="Segoe UI Symbol" w:cs="Segoe UI Symbol"/>
         </w:rPr>
-        <w:t xml:space="preserve"> </w:t>
-      </w:r>
-      <w:r>
-        <w:rPr>
-          <w:rFonts w:ascii="Segoe UI Symbol" w:eastAsia="Segoe UI Symbol" w:hAnsi="Segoe UI Symbol" w:cs="Segoe UI Symbol"/>
-        </w:rPr>
-        <w:t xml:space="preserve">  </w:t>
+        <w:t xml:space="preserve">   </w:t>
       </w:r>
       <w:r>
         <w:t>Write prompt: provide only the stock universe + allocation instructions</w:t>
@@ -1811,13 +1802,7 @@
         <w:rPr>
           <w:rFonts w:ascii="Segoe UI Symbol" w:eastAsia="Segoe UI Symbol" w:hAnsi="Segoe UI Symbol" w:cs="Segoe UI Symbol"/>
         </w:rPr>
-        <w:t xml:space="preserve"> </w:t>
-      </w:r>
-      <w:r>
-        <w:rPr>
-          <w:rFonts w:ascii="Segoe UI Symbol" w:eastAsia="Segoe UI Symbol" w:hAnsi="Segoe UI Symbol" w:cs="Segoe UI Symbol"/>
-        </w:rPr>
-        <w:t xml:space="preserve">  </w:t>
+        <w:t xml:space="preserve">   </w:t>
       </w:r>
       <w:r>
         <w:t>Instruct the LLM: "Respond ONLY with a JSON object mapping each ticker to a percentage weight. Weights must sum to 100. No explanation."</w:t>
@@ -1840,13 +1825,7 @@
         <w:rPr>
           <w:rFonts w:ascii="Segoe UI Symbol" w:eastAsia="Segoe UI Symbol" w:hAnsi="Segoe UI Symbol" w:cs="Segoe UI Symbol"/>
         </w:rPr>
-        <w:t xml:space="preserve"> </w:t>
-      </w:r>
-      <w:r>
-        <w:rPr>
-          <w:rFonts w:ascii="Segoe UI Symbol" w:eastAsia="Segoe UI Symbol" w:hAnsi="Segoe UI Symbol" w:cs="Segoe UI Symbol"/>
-        </w:rPr>
-        <w:t xml:space="preserve">  </w:t>
+        <w:t xml:space="preserve">   </w:t>
       </w:r>
       <w:r>
         <w:t>Test it — does the LLM return valid JSON?</w:t>
@@ -1869,13 +1848,7 @@
         <w:rPr>
           <w:rFonts w:ascii="Segoe UI Symbol" w:eastAsia="Segoe UI Symbol" w:hAnsi="Segoe UI Symbol" w:cs="Segoe UI Symbol"/>
         </w:rPr>
-        <w:t xml:space="preserve"> </w:t>
-      </w:r>
-      <w:r>
-        <w:rPr>
-          <w:rFonts w:ascii="Segoe UI Symbol" w:eastAsia="Segoe UI Symbol" w:hAnsi="Segoe UI Symbol" w:cs="Segoe UI Symbol"/>
-        </w:rPr>
-        <w:t xml:space="preserve">  </w:t>
+        <w:t xml:space="preserve">   </w:t>
       </w:r>
       <w:r>
         <w:t>Test it 5 times — can you parse every response?</w:t>
@@ -1904,9 +1877,17 @@
       <w:proofErr w:type="gramStart"/>
       <w:r>
         <w:rPr>
-          <w:rFonts w:ascii="Segoe UI Symbol" w:eastAsia="Segoe UI Symbol" w:hAnsi="Segoe UI Symbol" w:cs="Segoe UI Symbol"/>
-        </w:rPr>
-        <w:t xml:space="preserve">☐  </w:t>
+          <w:rFonts w:ascii="Segoe UI Symbol" w:hAnsi="Segoe UI Symbol" w:cs="Segoe UI Symbol"/>
+          <w:color w:val="E6E8F0"/>
+          <w:shd w:val="clear" w:color="auto" w:fill="1F1F1F"/>
+        </w:rPr>
+        <w:t>✓</w:t>
+      </w:r>
+      <w:r>
+        <w:rPr>
+          <w:rFonts w:ascii="Segoe UI Symbol" w:eastAsia="Segoe UI Symbol" w:hAnsi="Segoe UI Symbol" w:cs="Segoe UI Symbol"/>
+        </w:rPr>
+        <w:t xml:space="preserve">  </w:t>
       </w:r>
       <w:r>
         <w:t>Same</w:t>
@@ -1924,9 +1905,17 @@
       <w:proofErr w:type="gramStart"/>
       <w:r>
         <w:rPr>
-          <w:rFonts w:ascii="Segoe UI Symbol" w:eastAsia="Segoe UI Symbol" w:hAnsi="Segoe UI Symbol" w:cs="Segoe UI Symbol"/>
-        </w:rPr>
-        <w:t xml:space="preserve">☐  </w:t>
+          <w:rFonts w:ascii="Segoe UI Symbol" w:hAnsi="Segoe UI Symbol" w:cs="Segoe UI Symbol"/>
+          <w:color w:val="E6E8F0"/>
+          <w:shd w:val="clear" w:color="auto" w:fill="1F1F1F"/>
+        </w:rPr>
+        <w:t>✓</w:t>
+      </w:r>
+      <w:r>
+        <w:rPr>
+          <w:rFonts w:ascii="Segoe UI Symbol" w:eastAsia="Segoe UI Symbol" w:hAnsi="Segoe UI Symbol" w:cs="Segoe UI Symbol"/>
+        </w:rPr>
+        <w:t xml:space="preserve">  </w:t>
       </w:r>
       <w:r>
         <w:t>Add</w:t>
@@ -1944,9 +1933,17 @@
       <w:proofErr w:type="gramStart"/>
       <w:r>
         <w:rPr>
-          <w:rFonts w:ascii="Segoe UI Symbol" w:eastAsia="Segoe UI Symbol" w:hAnsi="Segoe UI Symbol" w:cs="Segoe UI Symbol"/>
-        </w:rPr>
-        <w:t xml:space="preserve">☐  </w:t>
+          <w:rFonts w:ascii="Segoe UI Symbol" w:hAnsi="Segoe UI Symbol" w:cs="Segoe UI Symbol"/>
+          <w:color w:val="E6E8F0"/>
+          <w:shd w:val="clear" w:color="auto" w:fill="1F1F1F"/>
+        </w:rPr>
+        <w:t>✓</w:t>
+      </w:r>
+      <w:r>
+        <w:rPr>
+          <w:rFonts w:ascii="Segoe UI Symbol" w:eastAsia="Segoe UI Symbol" w:hAnsi="Segoe UI Symbol" w:cs="Segoe UI Symbol"/>
+        </w:rPr>
+        <w:t xml:space="preserve">  </w:t>
       </w:r>
       <w:r>
         <w:t>Format</w:t>
@@ -1964,9 +1961,17 @@
       <w:proofErr w:type="gramStart"/>
       <w:r>
         <w:rPr>
-          <w:rFonts w:ascii="Segoe UI Symbol" w:eastAsia="Segoe UI Symbol" w:hAnsi="Segoe UI Symbol" w:cs="Segoe UI Symbol"/>
-        </w:rPr>
-        <w:t xml:space="preserve">☐  </w:t>
+          <w:rFonts w:ascii="Segoe UI Symbol" w:hAnsi="Segoe UI Symbol" w:cs="Segoe UI Symbol"/>
+          <w:color w:val="E6E8F0"/>
+          <w:shd w:val="clear" w:color="auto" w:fill="1F1F1F"/>
+        </w:rPr>
+        <w:t>✓</w:t>
+      </w:r>
+      <w:r>
+        <w:rPr>
+          <w:rFonts w:ascii="Segoe UI Symbol" w:eastAsia="Segoe UI Symbol" w:hAnsi="Segoe UI Symbol" w:cs="Segoe UI Symbol"/>
+        </w:rPr>
+        <w:t xml:space="preserve">  </w:t>
       </w:r>
       <w:r>
         <w:t>Test</w:t>
@@ -2007,9 +2012,17 @@
       <w:proofErr w:type="gramStart"/>
       <w:r>
         <w:rPr>
-          <w:rFonts w:ascii="Segoe UI Symbol" w:eastAsia="Segoe UI Symbol" w:hAnsi="Segoe UI Symbol" w:cs="Segoe UI Symbol"/>
-        </w:rPr>
-        <w:t xml:space="preserve">☐  </w:t>
+          <w:rFonts w:ascii="Segoe UI Symbol" w:hAnsi="Segoe UI Symbol" w:cs="Segoe UI Symbol"/>
+          <w:color w:val="E6E8F0"/>
+          <w:shd w:val="clear" w:color="auto" w:fill="1F1F1F"/>
+        </w:rPr>
+        <w:t>✓</w:t>
+      </w:r>
+      <w:r>
+        <w:rPr>
+          <w:rFonts w:ascii="Segoe UI Symbol" w:eastAsia="Segoe UI Symbol" w:hAnsi="Segoe UI Symbol" w:cs="Segoe UI Symbol"/>
+        </w:rPr>
+        <w:t xml:space="preserve">  </w:t>
       </w:r>
       <w:r>
         <w:t>Same</w:t>
@@ -2027,9 +2040,17 @@
       <w:proofErr w:type="gramStart"/>
       <w:r>
         <w:rPr>
-          <w:rFonts w:ascii="Segoe UI Symbol" w:eastAsia="Segoe UI Symbol" w:hAnsi="Segoe UI Symbol" w:cs="Segoe UI Symbol"/>
-        </w:rPr>
-        <w:t xml:space="preserve">☐  </w:t>
+          <w:rFonts w:ascii="Segoe UI Symbol" w:hAnsi="Segoe UI Symbol" w:cs="Segoe UI Symbol"/>
+          <w:color w:val="E6E8F0"/>
+          <w:shd w:val="clear" w:color="auto" w:fill="1F1F1F"/>
+        </w:rPr>
+        <w:t>✓</w:t>
+      </w:r>
+      <w:r>
+        <w:rPr>
+          <w:rFonts w:ascii="Segoe UI Symbol" w:eastAsia="Segoe UI Symbol" w:hAnsi="Segoe UI Symbol" w:cs="Segoe UI Symbol"/>
+        </w:rPr>
+        <w:t xml:space="preserve">  </w:t>
       </w:r>
       <w:r>
         <w:t>Add</w:t>
@@ -2047,9 +2068,17 @@
       <w:proofErr w:type="gramStart"/>
       <w:r>
         <w:rPr>
-          <w:rFonts w:ascii="Segoe UI Symbol" w:eastAsia="Segoe UI Symbol" w:hAnsi="Segoe UI Symbol" w:cs="Segoe UI Symbol"/>
-        </w:rPr>
-        <w:t xml:space="preserve">☐  </w:t>
+          <w:rFonts w:ascii="Segoe UI Symbol" w:hAnsi="Segoe UI Symbol" w:cs="Segoe UI Symbol"/>
+          <w:color w:val="E6E8F0"/>
+          <w:shd w:val="clear" w:color="auto" w:fill="1F1F1F"/>
+        </w:rPr>
+        <w:t>✓</w:t>
+      </w:r>
+      <w:r>
+        <w:rPr>
+          <w:rFonts w:ascii="Segoe UI Symbol" w:eastAsia="Segoe UI Symbol" w:hAnsi="Segoe UI Symbol" w:cs="Segoe UI Symbol"/>
+        </w:rPr>
+        <w:t xml:space="preserve">  </w:t>
       </w:r>
       <w:r>
         <w:t>Test</w:t>
@@ -2090,9 +2119,17 @@
       <w:proofErr w:type="gramStart"/>
       <w:r>
         <w:rPr>
-          <w:rFonts w:ascii="Segoe UI Symbol" w:eastAsia="Segoe UI Symbol" w:hAnsi="Segoe UI Symbol" w:cs="Segoe UI Symbol"/>
-        </w:rPr>
-        <w:t xml:space="preserve">☐  </w:t>
+          <w:rFonts w:ascii="Segoe UI Symbol" w:hAnsi="Segoe UI Symbol" w:cs="Segoe UI Symbol"/>
+          <w:color w:val="E6E8F0"/>
+          <w:shd w:val="clear" w:color="auto" w:fill="1F1F1F"/>
+        </w:rPr>
+        <w:t>✓</w:t>
+      </w:r>
+      <w:r>
+        <w:rPr>
+          <w:rFonts w:ascii="Segoe UI Symbol" w:eastAsia="Segoe UI Symbol" w:hAnsi="Segoe UI Symbol" w:cs="Segoe UI Symbol"/>
+        </w:rPr>
+        <w:t xml:space="preserve">  </w:t>
       </w:r>
       <w:r>
         <w:t>Same</w:t>
@@ -2110,9 +2147,17 @@
       <w:proofErr w:type="gramStart"/>
       <w:r>
         <w:rPr>
-          <w:rFonts w:ascii="Segoe UI Symbol" w:eastAsia="Segoe UI Symbol" w:hAnsi="Segoe UI Symbol" w:cs="Segoe UI Symbol"/>
-        </w:rPr>
-        <w:t xml:space="preserve">☐  </w:t>
+          <w:rFonts w:ascii="Segoe UI Symbol" w:hAnsi="Segoe UI Symbol" w:cs="Segoe UI Symbol"/>
+          <w:color w:val="E6E8F0"/>
+          <w:shd w:val="clear" w:color="auto" w:fill="1F1F1F"/>
+        </w:rPr>
+        <w:t>✓</w:t>
+      </w:r>
+      <w:r>
+        <w:rPr>
+          <w:rFonts w:ascii="Segoe UI Symbol" w:eastAsia="Segoe UI Symbol" w:hAnsi="Segoe UI Symbol" w:cs="Segoe UI Symbol"/>
+        </w:rPr>
+        <w:t xml:space="preserve">  </w:t>
       </w:r>
       <w:r>
         <w:t>Add</w:t>
@@ -2130,9 +2175,17 @@
       <w:proofErr w:type="gramStart"/>
       <w:r>
         <w:rPr>
-          <w:rFonts w:ascii="Segoe UI Symbol" w:eastAsia="Segoe UI Symbol" w:hAnsi="Segoe UI Symbol" w:cs="Segoe UI Symbol"/>
-        </w:rPr>
-        <w:t xml:space="preserve">☐  </w:t>
+          <w:rFonts w:ascii="Segoe UI Symbol" w:hAnsi="Segoe UI Symbol" w:cs="Segoe UI Symbol"/>
+          <w:color w:val="E6E8F0"/>
+          <w:shd w:val="clear" w:color="auto" w:fill="1F1F1F"/>
+        </w:rPr>
+        <w:t>✓</w:t>
+      </w:r>
+      <w:r>
+        <w:rPr>
+          <w:rFonts w:ascii="Segoe UI Symbol" w:eastAsia="Segoe UI Symbol" w:hAnsi="Segoe UI Symbol" w:cs="Segoe UI Symbol"/>
+        </w:rPr>
+        <w:t xml:space="preserve">  </w:t>
       </w:r>
       <w:r>
         <w:t>Test</w:t>
@@ -2169,9 +2222,17 @@
       <w:proofErr w:type="gramStart"/>
       <w:r>
         <w:rPr>
-          <w:rFonts w:ascii="Segoe UI Symbol" w:eastAsia="Segoe UI Symbol" w:hAnsi="Segoe UI Symbol" w:cs="Segoe UI Symbol"/>
-        </w:rPr>
-        <w:t xml:space="preserve">☐  </w:t>
+          <w:rFonts w:ascii="Segoe UI Symbol" w:hAnsi="Segoe UI Symbol" w:cs="Segoe UI Symbol"/>
+          <w:color w:val="E6E8F0"/>
+          <w:shd w:val="clear" w:color="auto" w:fill="1F1F1F"/>
+        </w:rPr>
+        <w:t>✓</w:t>
+      </w:r>
+      <w:r>
+        <w:rPr>
+          <w:rFonts w:ascii="Segoe UI Symbol" w:eastAsia="Segoe UI Symbol" w:hAnsi="Segoe UI Symbol" w:cs="Segoe UI Symbol"/>
+        </w:rPr>
+        <w:t xml:space="preserve">  </w:t>
       </w:r>
       <w:r>
         <w:rPr>
@@ -2200,9 +2261,17 @@
       <w:proofErr w:type="gramStart"/>
       <w:r>
         <w:rPr>
-          <w:rFonts w:ascii="Segoe UI Symbol" w:eastAsia="Segoe UI Symbol" w:hAnsi="Segoe UI Symbol" w:cs="Segoe UI Symbol"/>
-        </w:rPr>
-        <w:t xml:space="preserve">☐  </w:t>
+          <w:rFonts w:ascii="Segoe UI Symbol" w:hAnsi="Segoe UI Symbol" w:cs="Segoe UI Symbol"/>
+          <w:color w:val="E6E8F0"/>
+          <w:shd w:val="clear" w:color="auto" w:fill="1F1F1F"/>
+        </w:rPr>
+        <w:t>✓</w:t>
+      </w:r>
+      <w:r>
+        <w:rPr>
+          <w:rFonts w:ascii="Segoe UI Symbol" w:eastAsia="Segoe UI Symbol" w:hAnsi="Segoe UI Symbol" w:cs="Segoe UI Symbol"/>
+        </w:rPr>
+        <w:t xml:space="preserve">  </w:t>
       </w:r>
       <w:r>
         <w:t>Validation</w:t>
@@ -2220,9 +2289,17 @@
       <w:proofErr w:type="gramStart"/>
       <w:r>
         <w:rPr>
-          <w:rFonts w:ascii="Segoe UI Symbol" w:eastAsia="Segoe UI Symbol" w:hAnsi="Segoe UI Symbol" w:cs="Segoe UI Symbol"/>
-        </w:rPr>
-        <w:t xml:space="preserve">☐  </w:t>
+          <w:rFonts w:ascii="Segoe UI Symbol" w:hAnsi="Segoe UI Symbol" w:cs="Segoe UI Symbol"/>
+          <w:color w:val="E6E8F0"/>
+          <w:shd w:val="clear" w:color="auto" w:fill="1F1F1F"/>
+        </w:rPr>
+        <w:t>✓</w:t>
+      </w:r>
+      <w:r>
+        <w:rPr>
+          <w:rFonts w:ascii="Segoe UI Symbol" w:eastAsia="Segoe UI Symbol" w:hAnsi="Segoe UI Symbol" w:cs="Segoe UI Symbol"/>
+        </w:rPr>
+        <w:t xml:space="preserve">  </w:t>
       </w:r>
       <w:r>
         <w:t>Normalization</w:t>
@@ -2240,9 +2317,17 @@
       <w:proofErr w:type="gramStart"/>
       <w:r>
         <w:rPr>
-          <w:rFonts w:ascii="Segoe UI Symbol" w:eastAsia="Segoe UI Symbol" w:hAnsi="Segoe UI Symbol" w:cs="Segoe UI Symbol"/>
-        </w:rPr>
-        <w:t xml:space="preserve">☐  </w:t>
+          <w:rFonts w:ascii="Segoe UI Symbol" w:hAnsi="Segoe UI Symbol" w:cs="Segoe UI Symbol"/>
+          <w:color w:val="E6E8F0"/>
+          <w:shd w:val="clear" w:color="auto" w:fill="1F1F1F"/>
+        </w:rPr>
+        <w:t>✓</w:t>
+      </w:r>
+      <w:r>
+        <w:rPr>
+          <w:rFonts w:ascii="Segoe UI Symbol" w:eastAsia="Segoe UI Symbol" w:hAnsi="Segoe UI Symbol" w:cs="Segoe UI Symbol"/>
+        </w:rPr>
+        <w:t xml:space="preserve">  </w:t>
       </w:r>
       <w:r>
         <w:t>Error</w:t>
@@ -2260,9 +2345,17 @@
       <w:proofErr w:type="gramStart"/>
       <w:r>
         <w:rPr>
-          <w:rFonts w:ascii="Segoe UI Symbol" w:eastAsia="Segoe UI Symbol" w:hAnsi="Segoe UI Symbol" w:cs="Segoe UI Symbol"/>
-        </w:rPr>
-        <w:t xml:space="preserve">☐  </w:t>
+          <w:rFonts w:ascii="Segoe UI Symbol" w:hAnsi="Segoe UI Symbol" w:cs="Segoe UI Symbol"/>
+          <w:color w:val="E6E8F0"/>
+          <w:shd w:val="clear" w:color="auto" w:fill="1F1F1F"/>
+        </w:rPr>
+        <w:t>✓</w:t>
+      </w:r>
+      <w:r>
+        <w:rPr>
+          <w:rFonts w:ascii="Segoe UI Symbol" w:eastAsia="Segoe UI Symbol" w:hAnsi="Segoe UI Symbol" w:cs="Segoe UI Symbol"/>
+        </w:rPr>
+        <w:t xml:space="preserve">  </w:t>
       </w:r>
       <w:r>
         <w:t>Test</w:t>
@@ -2317,9 +2410,17 @@
       <w:proofErr w:type="gramStart"/>
       <w:r>
         <w:rPr>
-          <w:rFonts w:ascii="Segoe UI Symbol" w:eastAsia="Segoe UI Symbol" w:hAnsi="Segoe UI Symbol" w:cs="Segoe UI Symbol"/>
-        </w:rPr>
-        <w:t xml:space="preserve">☐  </w:t>
+          <w:rFonts w:ascii="Segoe UI Symbol" w:hAnsi="Segoe UI Symbol" w:cs="Segoe UI Symbol"/>
+          <w:color w:val="E6E8F0"/>
+          <w:shd w:val="clear" w:color="auto" w:fill="1F1F1F"/>
+        </w:rPr>
+        <w:t>✓</w:t>
+      </w:r>
+      <w:r>
+        <w:rPr>
+          <w:rFonts w:ascii="Segoe UI Symbol" w:eastAsia="Segoe UI Symbol" w:hAnsi="Segoe UI Symbol" w:cs="Segoe UI Symbol"/>
+        </w:rPr>
+        <w:t xml:space="preserve">  </w:t>
       </w:r>
       <w:r>
         <w:t>Write</w:t>
@@ -2337,9 +2438,17 @@
       <w:proofErr w:type="gramStart"/>
       <w:r>
         <w:rPr>
-          <w:rFonts w:ascii="Segoe UI Symbol" w:eastAsia="Segoe UI Symbol" w:hAnsi="Segoe UI Symbol" w:cs="Segoe UI Symbol"/>
-        </w:rPr>
-        <w:t xml:space="preserve">☐  </w:t>
+          <w:rFonts w:ascii="Segoe UI Symbol" w:hAnsi="Segoe UI Symbol" w:cs="Segoe UI Symbol"/>
+          <w:color w:val="E6E8F0"/>
+          <w:shd w:val="clear" w:color="auto" w:fill="1F1F1F"/>
+        </w:rPr>
+        <w:t>✓</w:t>
+      </w:r>
+      <w:r>
+        <w:rPr>
+          <w:rFonts w:ascii="Segoe UI Symbol" w:eastAsia="Segoe UI Symbol" w:hAnsi="Segoe UI Symbol" w:cs="Segoe UI Symbol"/>
+        </w:rPr>
+        <w:t xml:space="preserve">  </w:t>
       </w:r>
       <w:r>
         <w:t>Add</w:t>
@@ -2357,9 +2466,17 @@
       <w:proofErr w:type="gramStart"/>
       <w:r>
         <w:rPr>
-          <w:rFonts w:ascii="Segoe UI Symbol" w:eastAsia="Segoe UI Symbol" w:hAnsi="Segoe UI Symbol" w:cs="Segoe UI Symbol"/>
-        </w:rPr>
-        <w:t xml:space="preserve">☐  </w:t>
+          <w:rFonts w:ascii="Segoe UI Symbol" w:hAnsi="Segoe UI Symbol" w:cs="Segoe UI Symbol"/>
+          <w:color w:val="E6E8F0"/>
+          <w:shd w:val="clear" w:color="auto" w:fill="1F1F1F"/>
+        </w:rPr>
+        <w:t>✓</w:t>
+      </w:r>
+      <w:r>
+        <w:rPr>
+          <w:rFonts w:ascii="Segoe UI Symbol" w:eastAsia="Segoe UI Symbol" w:hAnsi="Segoe UI Symbol" w:cs="Segoe UI Symbol"/>
+        </w:rPr>
+        <w:t xml:space="preserve">  </w:t>
       </w:r>
       <w:r>
         <w:t>Add</w:t>
@@ -2377,9 +2494,17 @@
       <w:proofErr w:type="gramStart"/>
       <w:r>
         <w:rPr>
-          <w:rFonts w:ascii="Segoe UI Symbol" w:eastAsia="Segoe UI Symbol" w:hAnsi="Segoe UI Symbol" w:cs="Segoe UI Symbol"/>
-        </w:rPr>
-        <w:t xml:space="preserve">☐  </w:t>
+          <w:rFonts w:ascii="Segoe UI Symbol" w:hAnsi="Segoe UI Symbol" w:cs="Segoe UI Symbol"/>
+          <w:color w:val="E6E8F0"/>
+          <w:shd w:val="clear" w:color="auto" w:fill="1F1F1F"/>
+        </w:rPr>
+        <w:t>✓</w:t>
+      </w:r>
+      <w:r>
+        <w:rPr>
+          <w:rFonts w:ascii="Segoe UI Symbol" w:eastAsia="Segoe UI Symbol" w:hAnsi="Segoe UI Symbol" w:cs="Segoe UI Symbol"/>
+        </w:rPr>
+        <w:t xml:space="preserve">  </w:t>
       </w:r>
       <w:r>
         <w:t>Add</w:t>
@@ -2397,9 +2522,17 @@
       <w:proofErr w:type="gramStart"/>
       <w:r>
         <w:rPr>
-          <w:rFonts w:ascii="Segoe UI Symbol" w:eastAsia="Segoe UI Symbol" w:hAnsi="Segoe UI Symbol" w:cs="Segoe UI Symbol"/>
-        </w:rPr>
-        <w:t xml:space="preserve">☐  </w:t>
+          <w:rFonts w:ascii="Segoe UI Symbol" w:hAnsi="Segoe UI Symbol" w:cs="Segoe UI Symbol"/>
+          <w:color w:val="E6E8F0"/>
+          <w:shd w:val="clear" w:color="auto" w:fill="1F1F1F"/>
+        </w:rPr>
+        <w:t>✓</w:t>
+      </w:r>
+      <w:r>
+        <w:rPr>
+          <w:rFonts w:ascii="Segoe UI Symbol" w:eastAsia="Segoe UI Symbol" w:hAnsi="Segoe UI Symbol" w:cs="Segoe UI Symbol"/>
+        </w:rPr>
+        <w:t xml:space="preserve">  </w:t>
       </w:r>
       <w:r>
         <w:t>Run</w:t>
@@ -2417,9 +2550,17 @@
       <w:proofErr w:type="gramStart"/>
       <w:r>
         <w:rPr>
-          <w:rFonts w:ascii="Segoe UI Symbol" w:eastAsia="Segoe UI Symbol" w:hAnsi="Segoe UI Symbol" w:cs="Segoe UI Symbol"/>
-        </w:rPr>
-        <w:t xml:space="preserve">☐  </w:t>
+          <w:rFonts w:ascii="Segoe UI Symbol" w:hAnsi="Segoe UI Symbol" w:cs="Segoe UI Symbol"/>
+          <w:color w:val="E6E8F0"/>
+          <w:shd w:val="clear" w:color="auto" w:fill="1F1F1F"/>
+        </w:rPr>
+        <w:t>✓</w:t>
+      </w:r>
+      <w:r>
+        <w:rPr>
+          <w:rFonts w:ascii="Segoe UI Symbol" w:eastAsia="Segoe UI Symbol" w:hAnsi="Segoe UI Symbol" w:cs="Segoe UI Symbol"/>
+        </w:rPr>
+        <w:t xml:space="preserve">  </w:t>
       </w:r>
       <w:r>
         <w:t>Verify</w:t>
@@ -2472,9 +2613,17 @@
       <w:proofErr w:type="gramStart"/>
       <w:r>
         <w:rPr>
-          <w:rFonts w:ascii="Segoe UI Symbol" w:eastAsia="Segoe UI Symbol" w:hAnsi="Segoe UI Symbol" w:cs="Segoe UI Symbol"/>
-        </w:rPr>
-        <w:t xml:space="preserve">☐  </w:t>
+          <w:rFonts w:ascii="Segoe UI Symbol" w:hAnsi="Segoe UI Symbol" w:cs="Segoe UI Symbol"/>
+          <w:color w:val="E6E8F0"/>
+          <w:shd w:val="clear" w:color="auto" w:fill="1F1F1F"/>
+        </w:rPr>
+        <w:t>✓</w:t>
+      </w:r>
+      <w:r>
+        <w:rPr>
+          <w:rFonts w:ascii="Segoe UI Symbol" w:eastAsia="Segoe UI Symbol" w:hAnsi="Segoe UI Symbol" w:cs="Segoe UI Symbol"/>
+        </w:rPr>
+        <w:t xml:space="preserve">  </w:t>
       </w:r>
       <w:r>
         <w:t>Use</w:t>
@@ -2492,9 +2641,17 @@
       <w:proofErr w:type="gramStart"/>
       <w:r>
         <w:rPr>
-          <w:rFonts w:ascii="Segoe UI Symbol" w:eastAsia="Segoe UI Symbol" w:hAnsi="Segoe UI Symbol" w:cs="Segoe UI Symbol"/>
-        </w:rPr>
-        <w:t xml:space="preserve">☐  </w:t>
+          <w:rFonts w:ascii="Segoe UI Symbol" w:hAnsi="Segoe UI Symbol" w:cs="Segoe UI Symbol"/>
+          <w:color w:val="E6E8F0"/>
+          <w:shd w:val="clear" w:color="auto" w:fill="1F1F1F"/>
+        </w:rPr>
+        <w:t>✓</w:t>
+      </w:r>
+      <w:r>
+        <w:rPr>
+          <w:rFonts w:ascii="Segoe UI Symbol" w:eastAsia="Segoe UI Symbol" w:hAnsi="Segoe UI Symbol" w:cs="Segoe UI Symbol"/>
+        </w:rPr>
+        <w:t xml:space="preserve">  </w:t>
       </w:r>
       <w:r>
         <w:t>Run</w:t>
@@ -2512,9 +2669,17 @@
       <w:proofErr w:type="gramStart"/>
       <w:r>
         <w:rPr>
-          <w:rFonts w:ascii="Segoe UI Symbol" w:eastAsia="Segoe UI Symbol" w:hAnsi="Segoe UI Symbol" w:cs="Segoe UI Symbol"/>
-        </w:rPr>
-        <w:t xml:space="preserve">☐  </w:t>
+          <w:rFonts w:ascii="Segoe UI Symbol" w:hAnsi="Segoe UI Symbol" w:cs="Segoe UI Symbol"/>
+          <w:color w:val="E6E8F0"/>
+          <w:shd w:val="clear" w:color="auto" w:fill="1F1F1F"/>
+        </w:rPr>
+        <w:t>✓</w:t>
+      </w:r>
+      <w:r>
+        <w:rPr>
+          <w:rFonts w:ascii="Segoe UI Symbol" w:eastAsia="Segoe UI Symbol" w:hAnsi="Segoe UI Symbol" w:cs="Segoe UI Symbol"/>
+        </w:rPr>
+        <w:t xml:space="preserve">  </w:t>
       </w:r>
       <w:r>
         <w:t>Target</w:t>
@@ -2532,9 +2697,17 @@
       <w:proofErr w:type="gramStart"/>
       <w:r>
         <w:rPr>
-          <w:rFonts w:ascii="Segoe UI Symbol" w:eastAsia="Segoe UI Symbol" w:hAnsi="Segoe UI Symbol" w:cs="Segoe UI Symbol"/>
-        </w:rPr>
-        <w:t xml:space="preserve">☐  </w:t>
+          <w:rFonts w:ascii="Segoe UI Symbol" w:hAnsi="Segoe UI Symbol" w:cs="Segoe UI Symbol"/>
+          <w:color w:val="E6E8F0"/>
+          <w:shd w:val="clear" w:color="auto" w:fill="1F1F1F"/>
+        </w:rPr>
+        <w:t>✓</w:t>
+      </w:r>
+      <w:r>
+        <w:rPr>
+          <w:rFonts w:ascii="Segoe UI Symbol" w:eastAsia="Segoe UI Symbol" w:hAnsi="Segoe UI Symbol" w:cs="Segoe UI Symbol"/>
+        </w:rPr>
+        <w:t xml:space="preserve">  </w:t>
       </w:r>
       <w:r>
         <w:t>Estimate</w:t>
@@ -2563,9 +2736,17 @@
       <w:proofErr w:type="gramStart"/>
       <w:r>
         <w:rPr>
-          <w:rFonts w:ascii="Segoe UI Symbol" w:eastAsia="Segoe UI Symbol" w:hAnsi="Segoe UI Symbol" w:cs="Segoe UI Symbol"/>
-        </w:rPr>
-        <w:t xml:space="preserve">☐  </w:t>
+          <w:rFonts w:ascii="Segoe UI Symbol" w:hAnsi="Segoe UI Symbol" w:cs="Segoe UI Symbol"/>
+          <w:color w:val="E6E8F0"/>
+          <w:shd w:val="clear" w:color="auto" w:fill="1F1F1F"/>
+        </w:rPr>
+        <w:t>✓</w:t>
+      </w:r>
+      <w:r>
+        <w:rPr>
+          <w:rFonts w:ascii="Segoe UI Symbol" w:eastAsia="Segoe UI Symbol" w:hAnsi="Segoe UI Symbol" w:cs="Segoe UI Symbol"/>
+        </w:rPr>
+        <w:t xml:space="preserve">  </w:t>
       </w:r>
       <w:r>
         <w:t>Run</w:t>
@@ -2583,9 +2764,17 @@
       <w:proofErr w:type="gramStart"/>
       <w:r>
         <w:rPr>
-          <w:rFonts w:ascii="Segoe UI Symbol" w:eastAsia="Segoe UI Symbol" w:hAnsi="Segoe UI Symbol" w:cs="Segoe UI Symbol"/>
-        </w:rPr>
-        <w:t xml:space="preserve">☐  </w:t>
+          <w:rFonts w:ascii="Segoe UI Symbol" w:hAnsi="Segoe UI Symbol" w:cs="Segoe UI Symbol"/>
+          <w:color w:val="E6E8F0"/>
+          <w:shd w:val="clear" w:color="auto" w:fill="1F1F1F"/>
+        </w:rPr>
+        <w:t>✓</w:t>
+      </w:r>
+      <w:r>
+        <w:rPr>
+          <w:rFonts w:ascii="Segoe UI Symbol" w:eastAsia="Segoe UI Symbol" w:hAnsi="Segoe UI Symbol" w:cs="Segoe UI Symbol"/>
+        </w:rPr>
+        <w:t xml:space="preserve">  </w:t>
       </w:r>
       <w:r>
         <w:t>Set</w:t>
@@ -2603,9 +2792,17 @@
       <w:proofErr w:type="gramStart"/>
       <w:r>
         <w:rPr>
-          <w:rFonts w:ascii="Segoe UI Symbol" w:eastAsia="Segoe UI Symbol" w:hAnsi="Segoe UI Symbol" w:cs="Segoe UI Symbol"/>
-        </w:rPr>
-        <w:t xml:space="preserve">☐  </w:t>
+          <w:rFonts w:ascii="Segoe UI Symbol" w:hAnsi="Segoe UI Symbol" w:cs="Segoe UI Symbol"/>
+          <w:color w:val="E6E8F0"/>
+          <w:shd w:val="clear" w:color="auto" w:fill="1F1F1F"/>
+        </w:rPr>
+        <w:t>✓</w:t>
+      </w:r>
+      <w:r>
+        <w:rPr>
+          <w:rFonts w:ascii="Segoe UI Symbol" w:eastAsia="Segoe UI Symbol" w:hAnsi="Segoe UI Symbol" w:cs="Segoe UI Symbol"/>
+        </w:rPr>
+        <w:t xml:space="preserve">  </w:t>
       </w:r>
       <w:r>
         <w:t>Monitor</w:t>
@@ -2631,9 +2828,17 @@
       <w:proofErr w:type="gramStart"/>
       <w:r>
         <w:rPr>
-          <w:rFonts w:ascii="Segoe UI Symbol" w:eastAsia="Segoe UI Symbol" w:hAnsi="Segoe UI Symbol" w:cs="Segoe UI Symbol"/>
-        </w:rPr>
-        <w:t xml:space="preserve">☐  </w:t>
+          <w:rFonts w:ascii="Segoe UI Symbol" w:hAnsi="Segoe UI Symbol" w:cs="Segoe UI Symbol"/>
+          <w:color w:val="E6E8F0"/>
+          <w:shd w:val="clear" w:color="auto" w:fill="1F1F1F"/>
+        </w:rPr>
+        <w:t>✓</w:t>
+      </w:r>
+      <w:r>
+        <w:rPr>
+          <w:rFonts w:ascii="Segoe UI Symbol" w:eastAsia="Segoe UI Symbol" w:hAnsi="Segoe UI Symbol" w:cs="Segoe UI Symbol"/>
+        </w:rPr>
+        <w:t xml:space="preserve">  </w:t>
       </w:r>
       <w:r>
         <w:t>Save</w:t>
@@ -2659,9 +2864,17 @@
       <w:proofErr w:type="gramStart"/>
       <w:r>
         <w:rPr>
-          <w:rFonts w:ascii="Segoe UI Symbol" w:eastAsia="Segoe UI Symbol" w:hAnsi="Segoe UI Symbol" w:cs="Segoe UI Symbol"/>
-        </w:rPr>
-        <w:t xml:space="preserve">☐  </w:t>
+          <w:rFonts w:ascii="Segoe UI Symbol" w:hAnsi="Segoe UI Symbol" w:cs="Segoe UI Symbol"/>
+          <w:color w:val="E6E8F0"/>
+          <w:shd w:val="clear" w:color="auto" w:fill="1F1F1F"/>
+        </w:rPr>
+        <w:t>✓</w:t>
+      </w:r>
+      <w:r>
+        <w:rPr>
+          <w:rFonts w:ascii="Segoe UI Symbol" w:eastAsia="Segoe UI Symbol" w:hAnsi="Segoe UI Symbol" w:cs="Segoe UI Symbol"/>
+        </w:rPr>
+        <w:t xml:space="preserve">  </w:t>
       </w:r>
       <w:r>
         <w:t>Save</w:t>
@@ -2703,9 +2916,17 @@
       <w:proofErr w:type="gramStart"/>
       <w:r>
         <w:rPr>
-          <w:rFonts w:ascii="Segoe UI Symbol" w:eastAsia="Segoe UI Symbol" w:hAnsi="Segoe UI Symbol" w:cs="Segoe UI Symbol"/>
-        </w:rPr>
-        <w:t xml:space="preserve">☐  </w:t>
+          <w:rFonts w:ascii="Segoe UI Symbol" w:hAnsi="Segoe UI Symbol" w:cs="Segoe UI Symbol"/>
+          <w:color w:val="E6E8F0"/>
+          <w:shd w:val="clear" w:color="auto" w:fill="1F1F1F"/>
+        </w:rPr>
+        <w:t>✓</w:t>
+      </w:r>
+      <w:r>
+        <w:rPr>
+          <w:rFonts w:ascii="Segoe UI Symbol" w:eastAsia="Segoe UI Symbol" w:hAnsi="Segoe UI Symbol" w:cs="Segoe UI Symbol"/>
+        </w:rPr>
+        <w:t xml:space="preserve">  </w:t>
       </w:r>
       <w:r>
         <w:t>What</w:t>
@@ -2723,9 +2944,17 @@
       <w:proofErr w:type="gramStart"/>
       <w:r>
         <w:rPr>
-          <w:rFonts w:ascii="Segoe UI Symbol" w:eastAsia="Segoe UI Symbol" w:hAnsi="Segoe UI Symbol" w:cs="Segoe UI Symbol"/>
-        </w:rPr>
-        <w:t xml:space="preserve">☐  </w:t>
+          <w:rFonts w:ascii="Segoe UI Symbol" w:hAnsi="Segoe UI Symbol" w:cs="Segoe UI Symbol"/>
+          <w:color w:val="E6E8F0"/>
+          <w:shd w:val="clear" w:color="auto" w:fill="1F1F1F"/>
+        </w:rPr>
+        <w:t>✓</w:t>
+      </w:r>
+      <w:r>
+        <w:rPr>
+          <w:rFonts w:ascii="Segoe UI Symbol" w:eastAsia="Segoe UI Symbol" w:hAnsi="Segoe UI Symbol" w:cs="Segoe UI Symbol"/>
+        </w:rPr>
+        <w:t xml:space="preserve">  </w:t>
       </w:r>
       <w:r>
         <w:t>Do</w:t>
@@ -2743,9 +2972,17 @@
       <w:proofErr w:type="gramStart"/>
       <w:r>
         <w:rPr>
-          <w:rFonts w:ascii="Segoe UI Symbol" w:eastAsia="Segoe UI Symbol" w:hAnsi="Segoe UI Symbol" w:cs="Segoe UI Symbol"/>
-        </w:rPr>
-        <w:t xml:space="preserve">☐  </w:t>
+          <w:rFonts w:ascii="Segoe UI Symbol" w:hAnsi="Segoe UI Symbol" w:cs="Segoe UI Symbol"/>
+          <w:color w:val="E6E8F0"/>
+          <w:shd w:val="clear" w:color="auto" w:fill="1F1F1F"/>
+        </w:rPr>
+        <w:t>✓</w:t>
+      </w:r>
+      <w:r>
+        <w:rPr>
+          <w:rFonts w:ascii="Segoe UI Symbol" w:eastAsia="Segoe UI Symbol" w:hAnsi="Segoe UI Symbol" w:cs="Segoe UI Symbol"/>
+        </w:rPr>
+        <w:t xml:space="preserve">  </w:t>
       </w:r>
       <w:r>
         <w:t>Any</w:t>
@@ -2791,9 +3028,17 @@
       <w:proofErr w:type="gramStart"/>
       <w:r>
         <w:rPr>
-          <w:rFonts w:ascii="Segoe UI Symbol" w:eastAsia="Segoe UI Symbol" w:hAnsi="Segoe UI Symbol" w:cs="Segoe UI Symbol"/>
-        </w:rPr>
-        <w:t xml:space="preserve">☐  </w:t>
+          <w:rFonts w:ascii="Segoe UI Symbol" w:hAnsi="Segoe UI Symbol" w:cs="Segoe UI Symbol"/>
+          <w:color w:val="E6E8F0"/>
+          <w:shd w:val="clear" w:color="auto" w:fill="1F1F1F"/>
+        </w:rPr>
+        <w:t>✓</w:t>
+      </w:r>
+      <w:r>
+        <w:rPr>
+          <w:rFonts w:ascii="Segoe UI Symbol" w:eastAsia="Segoe UI Symbol" w:hAnsi="Segoe UI Symbol" w:cs="Segoe UI Symbol"/>
+        </w:rPr>
+        <w:t xml:space="preserve">  </w:t>
       </w:r>
       <w:r>
         <w:t>For</w:t>
@@ -2811,9 +3056,17 @@
       <w:proofErr w:type="gramStart"/>
       <w:r>
         <w:rPr>
-          <w:rFonts w:ascii="Segoe UI Symbol" w:eastAsia="Segoe UI Symbol" w:hAnsi="Segoe UI Symbol" w:cs="Segoe UI Symbol"/>
-        </w:rPr>
-        <w:t xml:space="preserve">☐  </w:t>
+          <w:rFonts w:ascii="Segoe UI Symbol" w:hAnsi="Segoe UI Symbol" w:cs="Segoe UI Symbol"/>
+          <w:color w:val="E6E8F0"/>
+          <w:shd w:val="clear" w:color="auto" w:fill="1F1F1F"/>
+        </w:rPr>
+        <w:t>✓</w:t>
+      </w:r>
+      <w:r>
+        <w:rPr>
+          <w:rFonts w:ascii="Segoe UI Symbol" w:eastAsia="Segoe UI Symbol" w:hAnsi="Segoe UI Symbol" w:cs="Segoe UI Symbol"/>
+        </w:rPr>
+        <w:t xml:space="preserve">  </w:t>
       </w:r>
       <w:r>
         <w:t>Compute</w:t>
@@ -2880,9 +3133,17 @@
       <w:proofErr w:type="gramStart"/>
       <w:r>
         <w:rPr>
-          <w:rFonts w:ascii="Segoe UI Symbol" w:eastAsia="Segoe UI Symbol" w:hAnsi="Segoe UI Symbol" w:cs="Segoe UI Symbol"/>
-        </w:rPr>
-        <w:t xml:space="preserve">☐  </w:t>
+          <w:rFonts w:ascii="Segoe UI Symbol" w:hAnsi="Segoe UI Symbol" w:cs="Segoe UI Symbol"/>
+          <w:color w:val="E6E8F0"/>
+          <w:shd w:val="clear" w:color="auto" w:fill="1F1F1F"/>
+        </w:rPr>
+        <w:t>✓</w:t>
+      </w:r>
+      <w:r>
+        <w:rPr>
+          <w:rFonts w:ascii="Segoe UI Symbol" w:eastAsia="Segoe UI Symbol" w:hAnsi="Segoe UI Symbol" w:cs="Segoe UI Symbol"/>
+        </w:rPr>
+        <w:t xml:space="preserve">  </w:t>
       </w:r>
       <w:r>
         <w:rPr>
@@ -2911,9 +3172,17 @@
       <w:proofErr w:type="gramStart"/>
       <w:r>
         <w:rPr>
-          <w:rFonts w:ascii="Segoe UI Symbol" w:eastAsia="Segoe UI Symbol" w:hAnsi="Segoe UI Symbol" w:cs="Segoe UI Symbol"/>
-        </w:rPr>
-        <w:t xml:space="preserve">☐  </w:t>
+          <w:rFonts w:ascii="Segoe UI Symbol" w:hAnsi="Segoe UI Symbol" w:cs="Segoe UI Symbol"/>
+          <w:color w:val="E6E8F0"/>
+          <w:shd w:val="clear" w:color="auto" w:fill="1F1F1F"/>
+        </w:rPr>
+        <w:t>✓</w:t>
+      </w:r>
+      <w:r>
+        <w:rPr>
+          <w:rFonts w:ascii="Segoe UI Symbol" w:eastAsia="Segoe UI Symbol" w:hAnsi="Segoe UI Symbol" w:cs="Segoe UI Symbol"/>
+        </w:rPr>
+        <w:t xml:space="preserve">  </w:t>
       </w:r>
       <w:r>
         <w:rPr>
@@ -2942,9 +3211,17 @@
       <w:proofErr w:type="gramStart"/>
       <w:r>
         <w:rPr>
-          <w:rFonts w:ascii="Segoe UI Symbol" w:eastAsia="Segoe UI Symbol" w:hAnsi="Segoe UI Symbol" w:cs="Segoe UI Symbol"/>
-        </w:rPr>
-        <w:t xml:space="preserve">☐  </w:t>
+          <w:rFonts w:ascii="Segoe UI Symbol" w:hAnsi="Segoe UI Symbol" w:cs="Segoe UI Symbol"/>
+          <w:color w:val="E6E8F0"/>
+          <w:shd w:val="clear" w:color="auto" w:fill="1F1F1F"/>
+        </w:rPr>
+        <w:t>✓</w:t>
+      </w:r>
+      <w:r>
+        <w:rPr>
+          <w:rFonts w:ascii="Segoe UI Symbol" w:eastAsia="Segoe UI Symbol" w:hAnsi="Segoe UI Symbol" w:cs="Segoe UI Symbol"/>
+        </w:rPr>
+        <w:t xml:space="preserve">  </w:t>
       </w:r>
       <w:r>
         <w:rPr>
@@ -2973,9 +3250,17 @@
       <w:proofErr w:type="gramStart"/>
       <w:r>
         <w:rPr>
-          <w:rFonts w:ascii="Segoe UI Symbol" w:eastAsia="Segoe UI Symbol" w:hAnsi="Segoe UI Symbol" w:cs="Segoe UI Symbol"/>
-        </w:rPr>
-        <w:t xml:space="preserve">☐  </w:t>
+          <w:rFonts w:ascii="Segoe UI Symbol" w:hAnsi="Segoe UI Symbol" w:cs="Segoe UI Symbol"/>
+          <w:color w:val="E6E8F0"/>
+          <w:shd w:val="clear" w:color="auto" w:fill="1F1F1F"/>
+        </w:rPr>
+        <w:t>✓</w:t>
+      </w:r>
+      <w:r>
+        <w:rPr>
+          <w:rFonts w:ascii="Segoe UI Symbol" w:eastAsia="Segoe UI Symbol" w:hAnsi="Segoe UI Symbol" w:cs="Segoe UI Symbol"/>
+        </w:rPr>
+        <w:t xml:space="preserve">  </w:t>
       </w:r>
       <w:r>
         <w:rPr>
@@ -3004,9 +3289,17 @@
       <w:proofErr w:type="gramStart"/>
       <w:r>
         <w:rPr>
-          <w:rFonts w:ascii="Segoe UI Symbol" w:eastAsia="Segoe UI Symbol" w:hAnsi="Segoe UI Symbol" w:cs="Segoe UI Symbol"/>
-        </w:rPr>
-        <w:t xml:space="preserve">☐  </w:t>
+          <w:rFonts w:ascii="Segoe UI Symbol" w:hAnsi="Segoe UI Symbol" w:cs="Segoe UI Symbol"/>
+          <w:color w:val="E6E8F0"/>
+          <w:shd w:val="clear" w:color="auto" w:fill="1F1F1F"/>
+        </w:rPr>
+        <w:t>✓</w:t>
+      </w:r>
+      <w:r>
+        <w:rPr>
+          <w:rFonts w:ascii="Segoe UI Symbol" w:eastAsia="Segoe UI Symbol" w:hAnsi="Segoe UI Symbol" w:cs="Segoe UI Symbol"/>
+        </w:rPr>
+        <w:t xml:space="preserve">  </w:t>
       </w:r>
       <w:r>
         <w:t>Save</w:t>
@@ -3091,9 +3384,17 @@
       <w:proofErr w:type="gramStart"/>
       <w:r>
         <w:rPr>
-          <w:rFonts w:ascii="Segoe UI Symbol" w:eastAsia="Segoe UI Symbol" w:hAnsi="Segoe UI Symbol" w:cs="Segoe UI Symbol"/>
-        </w:rPr>
-        <w:t xml:space="preserve">☐  </w:t>
+          <w:rFonts w:ascii="Segoe UI Symbol" w:hAnsi="Segoe UI Symbol" w:cs="Segoe UI Symbol"/>
+          <w:color w:val="E6E8F0"/>
+          <w:shd w:val="clear" w:color="auto" w:fill="1F1F1F"/>
+        </w:rPr>
+        <w:t>✓</w:t>
+      </w:r>
+      <w:r>
+        <w:rPr>
+          <w:rFonts w:ascii="Segoe UI Symbol" w:eastAsia="Segoe UI Symbol" w:hAnsi="Segoe UI Symbol" w:cs="Segoe UI Symbol"/>
+        </w:rPr>
+        <w:t xml:space="preserve">  </w:t>
       </w:r>
       <w:r>
         <w:t>Compute</w:t>
@@ -3111,9 +3412,17 @@
       <w:proofErr w:type="gramStart"/>
       <w:r>
         <w:rPr>
-          <w:rFonts w:ascii="Segoe UI Symbol" w:eastAsia="Segoe UI Symbol" w:hAnsi="Segoe UI Symbol" w:cs="Segoe UI Symbol"/>
-        </w:rPr>
-        <w:t xml:space="preserve">☐  </w:t>
+          <w:rFonts w:ascii="Segoe UI Symbol" w:hAnsi="Segoe UI Symbol" w:cs="Segoe UI Symbol"/>
+          <w:color w:val="E6E8F0"/>
+          <w:shd w:val="clear" w:color="auto" w:fill="1F1F1F"/>
+        </w:rPr>
+        <w:t>✓</w:t>
+      </w:r>
+      <w:r>
+        <w:rPr>
+          <w:rFonts w:ascii="Segoe UI Symbol" w:eastAsia="Segoe UI Symbol" w:hAnsi="Segoe UI Symbol" w:cs="Segoe UI Symbol"/>
+        </w:rPr>
+        <w:t xml:space="preserve">  </w:t>
       </w:r>
       <w:r>
         <w:t>Create</w:t>
@@ -3142,9 +3451,17 @@
       <w:proofErr w:type="gramStart"/>
       <w:r>
         <w:rPr>
-          <w:rFonts w:ascii="Segoe UI Symbol" w:eastAsia="Segoe UI Symbol" w:hAnsi="Segoe UI Symbol" w:cs="Segoe UI Symbol"/>
-        </w:rPr>
-        <w:t xml:space="preserve">☐  </w:t>
+          <w:rFonts w:ascii="Segoe UI Symbol" w:hAnsi="Segoe UI Symbol" w:cs="Segoe UI Symbol"/>
+          <w:color w:val="E6E8F0"/>
+          <w:shd w:val="clear" w:color="auto" w:fill="1F1F1F"/>
+        </w:rPr>
+        <w:t>✓</w:t>
+      </w:r>
+      <w:r>
+        <w:rPr>
+          <w:rFonts w:ascii="Segoe UI Symbol" w:eastAsia="Segoe UI Symbol" w:hAnsi="Segoe UI Symbol" w:cs="Segoe UI Symbol"/>
+        </w:rPr>
+        <w:t xml:space="preserve">  </w:t>
       </w:r>
       <w:r>
         <w:t>Difference</w:t>
@@ -3162,9 +3479,17 @@
       <w:proofErr w:type="gramStart"/>
       <w:r>
         <w:rPr>
-          <w:rFonts w:ascii="Segoe UI Symbol" w:eastAsia="Segoe UI Symbol" w:hAnsi="Segoe UI Symbol" w:cs="Segoe UI Symbol"/>
-        </w:rPr>
-        <w:t xml:space="preserve">☐  </w:t>
+          <w:rFonts w:ascii="Segoe UI Symbol" w:hAnsi="Segoe UI Symbol" w:cs="Segoe UI Symbol"/>
+          <w:color w:val="E6E8F0"/>
+          <w:shd w:val="clear" w:color="auto" w:fill="1F1F1F"/>
+        </w:rPr>
+        <w:t>✓</w:t>
+      </w:r>
+      <w:r>
+        <w:rPr>
+          <w:rFonts w:ascii="Segoe UI Symbol" w:eastAsia="Segoe UI Symbol" w:hAnsi="Segoe UI Symbol" w:cs="Segoe UI Symbol"/>
+        </w:rPr>
+        <w:t xml:space="preserve">  </w:t>
       </w:r>
       <w:r>
         <w:t>Compute</w:t>
@@ -3182,9 +3507,17 @@
       <w:proofErr w:type="gramStart"/>
       <w:r>
         <w:rPr>
-          <w:rFonts w:ascii="Segoe UI Symbol" w:eastAsia="Segoe UI Symbol" w:hAnsi="Segoe UI Symbol" w:cs="Segoe UI Symbol"/>
-        </w:rPr>
-        <w:t xml:space="preserve">☐  </w:t>
+          <w:rFonts w:ascii="Segoe UI Symbol" w:hAnsi="Segoe UI Symbol" w:cs="Segoe UI Symbol"/>
+          <w:color w:val="E6E8F0"/>
+          <w:shd w:val="clear" w:color="auto" w:fill="1F1F1F"/>
+        </w:rPr>
+        <w:t>✓</w:t>
+      </w:r>
+      <w:r>
+        <w:rPr>
+          <w:rFonts w:ascii="Segoe UI Symbol" w:eastAsia="Segoe UI Symbol" w:hAnsi="Segoe UI Symbol" w:cs="Segoe UI Symbol"/>
+        </w:rPr>
+        <w:t xml:space="preserve">  </w:t>
       </w:r>
       <w:r>
         <w:t>Run</w:t>
@@ -3202,9 +3535,17 @@
       <w:proofErr w:type="gramStart"/>
       <w:r>
         <w:rPr>
-          <w:rFonts w:ascii="Segoe UI Symbol" w:eastAsia="Segoe UI Symbol" w:hAnsi="Segoe UI Symbol" w:cs="Segoe UI Symbol"/>
-        </w:rPr>
-        <w:t xml:space="preserve">☐  </w:t>
+          <w:rFonts w:ascii="Segoe UI Symbol" w:hAnsi="Segoe UI Symbol" w:cs="Segoe UI Symbol"/>
+          <w:color w:val="E6E8F0"/>
+          <w:shd w:val="clear" w:color="auto" w:fill="1F1F1F"/>
+        </w:rPr>
+        <w:t>✓</w:t>
+      </w:r>
+      <w:r>
+        <w:rPr>
+          <w:rFonts w:ascii="Segoe UI Symbol" w:eastAsia="Segoe UI Symbol" w:hAnsi="Segoe UI Symbol" w:cs="Segoe UI Symbol"/>
+        </w:rPr>
+        <w:t xml:space="preserve">  </w:t>
       </w:r>
       <w:r>
         <w:t>Report</w:t>
@@ -3233,9 +3574,17 @@
       <w:proofErr w:type="gramStart"/>
       <w:r>
         <w:rPr>
-          <w:rFonts w:ascii="Segoe UI Symbol" w:eastAsia="Segoe UI Symbol" w:hAnsi="Segoe UI Symbol" w:cs="Segoe UI Symbol"/>
-        </w:rPr>
-        <w:t xml:space="preserve">☐  </w:t>
+          <w:rFonts w:ascii="Segoe UI Symbol" w:hAnsi="Segoe UI Symbol" w:cs="Segoe UI Symbol"/>
+          <w:color w:val="E6E8F0"/>
+          <w:shd w:val="clear" w:color="auto" w:fill="1F1F1F"/>
+        </w:rPr>
+        <w:t>✓</w:t>
+      </w:r>
+      <w:r>
+        <w:rPr>
+          <w:rFonts w:ascii="Segoe UI Symbol" w:eastAsia="Segoe UI Symbol" w:hAnsi="Segoe UI Symbol" w:cs="Segoe UI Symbol"/>
+        </w:rPr>
+        <w:t xml:space="preserve">  </w:t>
       </w:r>
       <w:r>
         <w:t>Run</w:t>
@@ -3290,9 +3639,17 @@
       <w:proofErr w:type="gramStart"/>
       <w:r>
         <w:rPr>
-          <w:rFonts w:ascii="Segoe UI Symbol" w:eastAsia="Segoe UI Symbol" w:hAnsi="Segoe UI Symbol" w:cs="Segoe UI Symbol"/>
-        </w:rPr>
-        <w:t xml:space="preserve">☐  </w:t>
+          <w:rFonts w:ascii="Segoe UI Symbol" w:hAnsi="Segoe UI Symbol" w:cs="Segoe UI Symbol"/>
+          <w:color w:val="E6E8F0"/>
+          <w:shd w:val="clear" w:color="auto" w:fill="1F1F1F"/>
+        </w:rPr>
+        <w:t>✓</w:t>
+      </w:r>
+      <w:r>
+        <w:rPr>
+          <w:rFonts w:ascii="Segoe UI Symbol" w:eastAsia="Segoe UI Symbol" w:hAnsi="Segoe UI Symbol" w:cs="Segoe UI Symbol"/>
+        </w:rPr>
+        <w:t xml:space="preserve">  </w:t>
       </w:r>
       <w:r>
         <w:t>Run</w:t>
@@ -3310,9 +3667,17 @@
       <w:proofErr w:type="gramStart"/>
       <w:r>
         <w:rPr>
-          <w:rFonts w:ascii="Segoe UI Symbol" w:eastAsia="Segoe UI Symbol" w:hAnsi="Segoe UI Symbol" w:cs="Segoe UI Symbol"/>
-        </w:rPr>
-        <w:t xml:space="preserve">☐  </w:t>
+          <w:rFonts w:ascii="Segoe UI Symbol" w:hAnsi="Segoe UI Symbol" w:cs="Segoe UI Symbol"/>
+          <w:color w:val="E6E8F0"/>
+          <w:shd w:val="clear" w:color="auto" w:fill="1F1F1F"/>
+        </w:rPr>
+        <w:t>✓</w:t>
+      </w:r>
+      <w:r>
+        <w:rPr>
+          <w:rFonts w:ascii="Segoe UI Symbol" w:eastAsia="Segoe UI Symbol" w:hAnsi="Segoe UI Symbol" w:cs="Segoe UI Symbol"/>
+        </w:rPr>
+        <w:t xml:space="preserve">  </w:t>
       </w:r>
       <w:r>
         <w:t>Report</w:t>
@@ -3330,9 +3695,17 @@
       <w:proofErr w:type="gramStart"/>
       <w:r>
         <w:rPr>
-          <w:rFonts w:ascii="Segoe UI Symbol" w:eastAsia="Segoe UI Symbol" w:hAnsi="Segoe UI Symbol" w:cs="Segoe UI Symbol"/>
-        </w:rPr>
-        <w:t xml:space="preserve">☐  </w:t>
+          <w:rFonts w:ascii="Segoe UI Symbol" w:hAnsi="Segoe UI Symbol" w:cs="Segoe UI Symbol"/>
+          <w:color w:val="E6E8F0"/>
+          <w:shd w:val="clear" w:color="auto" w:fill="1F1F1F"/>
+        </w:rPr>
+        <w:t>✓</w:t>
+      </w:r>
+      <w:r>
+        <w:rPr>
+          <w:rFonts w:ascii="Segoe UI Symbol" w:eastAsia="Segoe UI Symbol" w:hAnsi="Segoe UI Symbol" w:cs="Segoe UI Symbol"/>
+        </w:rPr>
+        <w:t xml:space="preserve">  </w:t>
       </w:r>
       <w:r>
         <w:t>Interpret</w:t>
@@ -3361,9 +3734,17 @@
       <w:proofErr w:type="gramStart"/>
       <w:r>
         <w:rPr>
-          <w:rFonts w:ascii="Segoe UI Symbol" w:eastAsia="Segoe UI Symbol" w:hAnsi="Segoe UI Symbol" w:cs="Segoe UI Symbol"/>
-        </w:rPr>
-        <w:t xml:space="preserve">☐  </w:t>
+          <w:rFonts w:ascii="Segoe UI Symbol" w:hAnsi="Segoe UI Symbol" w:cs="Segoe UI Symbol"/>
+          <w:color w:val="E6E8F0"/>
+          <w:shd w:val="clear" w:color="auto" w:fill="1F1F1F"/>
+        </w:rPr>
+        <w:t>✓</w:t>
+      </w:r>
+      <w:r>
+        <w:rPr>
+          <w:rFonts w:ascii="Segoe UI Symbol" w:eastAsia="Segoe UI Symbol" w:hAnsi="Segoe UI Symbol" w:cs="Segoe UI Symbol"/>
+        </w:rPr>
+        <w:t xml:space="preserve">  </w:t>
       </w:r>
       <w:r>
         <w:t>Check</w:t>
@@ -3381,9 +3762,17 @@
       <w:proofErr w:type="gramStart"/>
       <w:r>
         <w:rPr>
-          <w:rFonts w:ascii="Segoe UI Symbol" w:eastAsia="Segoe UI Symbol" w:hAnsi="Segoe UI Symbol" w:cs="Segoe UI Symbol"/>
-        </w:rPr>
-        <w:t xml:space="preserve">☐  </w:t>
+          <w:rFonts w:ascii="Segoe UI Symbol" w:hAnsi="Segoe UI Symbol" w:cs="Segoe UI Symbol"/>
+          <w:color w:val="E6E8F0"/>
+          <w:shd w:val="clear" w:color="auto" w:fill="1F1F1F"/>
+        </w:rPr>
+        <w:t>✓</w:t>
+      </w:r>
+      <w:r>
+        <w:rPr>
+          <w:rFonts w:ascii="Segoe UI Symbol" w:eastAsia="Segoe UI Symbol" w:hAnsi="Segoe UI Symbol" w:cs="Segoe UI Symbol"/>
+        </w:rPr>
+        <w:t xml:space="preserve">  </w:t>
       </w:r>
       <w:r>
         <w:t>Re</w:t>
@@ -3401,9 +3790,17 @@
       <w:proofErr w:type="gramStart"/>
       <w:r>
         <w:rPr>
-          <w:rFonts w:ascii="Segoe UI Symbol" w:eastAsia="Segoe UI Symbol" w:hAnsi="Segoe UI Symbol" w:cs="Segoe UI Symbol"/>
-        </w:rPr>
-        <w:t xml:space="preserve">☐  </w:t>
+          <w:rFonts w:ascii="Segoe UI Symbol" w:hAnsi="Segoe UI Symbol" w:cs="Segoe UI Symbol"/>
+          <w:color w:val="E6E8F0"/>
+          <w:shd w:val="clear" w:color="auto" w:fill="1F1F1F"/>
+        </w:rPr>
+        <w:t>✓</w:t>
+      </w:r>
+      <w:r>
+        <w:rPr>
+          <w:rFonts w:ascii="Segoe UI Symbol" w:eastAsia="Segoe UI Symbol" w:hAnsi="Segoe UI Symbol" w:cs="Segoe UI Symbol"/>
+        </w:rPr>
+        <w:t xml:space="preserve">  </w:t>
       </w:r>
       <w:r>
         <w:t>Optional</w:t>
@@ -3421,9 +3818,17 @@
       <w:proofErr w:type="gramStart"/>
       <w:r>
         <w:rPr>
-          <w:rFonts w:ascii="Segoe UI Symbol" w:eastAsia="Segoe UI Symbol" w:hAnsi="Segoe UI Symbol" w:cs="Segoe UI Symbol"/>
-        </w:rPr>
-        <w:t xml:space="preserve">☐  </w:t>
+          <w:rFonts w:ascii="Segoe UI Symbol" w:hAnsi="Segoe UI Symbol" w:cs="Segoe UI Symbol"/>
+          <w:color w:val="E6E8F0"/>
+          <w:shd w:val="clear" w:color="auto" w:fill="1F1F1F"/>
+        </w:rPr>
+        <w:t>✓</w:t>
+      </w:r>
+      <w:r>
+        <w:rPr>
+          <w:rFonts w:ascii="Segoe UI Symbol" w:eastAsia="Segoe UI Symbol" w:hAnsi="Segoe UI Symbol" w:cs="Segoe UI Symbol"/>
+        </w:rPr>
+        <w:t xml:space="preserve">  </w:t>
       </w:r>
       <w:r>
         <w:t>Optional</w:t>
@@ -3457,9 +3862,17 @@
       <w:proofErr w:type="gramStart"/>
       <w:r>
         <w:rPr>
-          <w:rFonts w:ascii="Segoe UI Symbol" w:eastAsia="Segoe UI Symbol" w:hAnsi="Segoe UI Symbol" w:cs="Segoe UI Symbol"/>
-        </w:rPr>
-        <w:t xml:space="preserve">☐  </w:t>
+          <w:rFonts w:ascii="Segoe UI Symbol" w:hAnsi="Segoe UI Symbol" w:cs="Segoe UI Symbol"/>
+          <w:color w:val="E6E8F0"/>
+          <w:shd w:val="clear" w:color="auto" w:fill="1F1F1F"/>
+        </w:rPr>
+        <w:t>✓</w:t>
+      </w:r>
+      <w:r>
+        <w:rPr>
+          <w:rFonts w:ascii="Segoe UI Symbol" w:eastAsia="Segoe UI Symbol" w:hAnsi="Segoe UI Symbol" w:cs="Segoe UI Symbol"/>
+        </w:rPr>
+        <w:t xml:space="preserve">  </w:t>
       </w:r>
       <w:r>
         <w:t>Bar</w:t>
@@ -3477,9 +3890,17 @@
       <w:proofErr w:type="gramStart"/>
       <w:r>
         <w:rPr>
-          <w:rFonts w:ascii="Segoe UI Symbol" w:eastAsia="Segoe UI Symbol" w:hAnsi="Segoe UI Symbol" w:cs="Segoe UI Symbol"/>
-        </w:rPr>
-        <w:t xml:space="preserve">☐  </w:t>
+          <w:rFonts w:ascii="Segoe UI Symbol" w:hAnsi="Segoe UI Symbol" w:cs="Segoe UI Symbol"/>
+          <w:color w:val="E6E8F0"/>
+          <w:shd w:val="clear" w:color="auto" w:fill="1F1F1F"/>
+        </w:rPr>
+        <w:t>✓</w:t>
+      </w:r>
+      <w:r>
+        <w:rPr>
+          <w:rFonts w:ascii="Segoe UI Symbol" w:eastAsia="Segoe UI Symbol" w:hAnsi="Segoe UI Symbol" w:cs="Segoe UI Symbol"/>
+        </w:rPr>
+        <w:t xml:space="preserve">  </w:t>
       </w:r>
       <w:r>
         <w:t>Bar</w:t>
@@ -3497,9 +3918,17 @@
       <w:proofErr w:type="gramStart"/>
       <w:r>
         <w:rPr>
-          <w:rFonts w:ascii="Segoe UI Symbol" w:eastAsia="Segoe UI Symbol" w:hAnsi="Segoe UI Symbol" w:cs="Segoe UI Symbol"/>
-        </w:rPr>
-        <w:t xml:space="preserve">☐  </w:t>
+          <w:rFonts w:ascii="Segoe UI Symbol" w:hAnsi="Segoe UI Symbol" w:cs="Segoe UI Symbol"/>
+          <w:color w:val="E6E8F0"/>
+          <w:shd w:val="clear" w:color="auto" w:fill="1F1F1F"/>
+        </w:rPr>
+        <w:t>✓</w:t>
+      </w:r>
+      <w:r>
+        <w:rPr>
+          <w:rFonts w:ascii="Segoe UI Symbol" w:eastAsia="Segoe UI Symbol" w:hAnsi="Segoe UI Symbol" w:cs="Segoe UI Symbol"/>
+        </w:rPr>
+        <w:t xml:space="preserve">  </w:t>
       </w:r>
       <w:r>
         <w:t>Bar</w:t>
@@ -3517,9 +3946,17 @@
       <w:proofErr w:type="gramStart"/>
       <w:r>
         <w:rPr>
-          <w:rFonts w:ascii="Segoe UI Symbol" w:eastAsia="Segoe UI Symbol" w:hAnsi="Segoe UI Symbol" w:cs="Segoe UI Symbol"/>
-        </w:rPr>
-        <w:t xml:space="preserve">☐  </w:t>
+          <w:rFonts w:ascii="Segoe UI Symbol" w:hAnsi="Segoe UI Symbol" w:cs="Segoe UI Symbol"/>
+          <w:color w:val="E6E8F0"/>
+          <w:shd w:val="clear" w:color="auto" w:fill="1F1F1F"/>
+        </w:rPr>
+        <w:t>✓</w:t>
+      </w:r>
+      <w:r>
+        <w:rPr>
+          <w:rFonts w:ascii="Segoe UI Symbol" w:eastAsia="Segoe UI Symbol" w:hAnsi="Segoe UI Symbol" w:cs="Segoe UI Symbol"/>
+        </w:rPr>
+        <w:t xml:space="preserve">  </w:t>
       </w:r>
       <w:r>
         <w:t>Stacked</w:t>
@@ -3537,9 +3974,17 @@
       <w:proofErr w:type="gramStart"/>
       <w:r>
         <w:rPr>
-          <w:rFonts w:ascii="Segoe UI Symbol" w:eastAsia="Segoe UI Symbol" w:hAnsi="Segoe UI Symbol" w:cs="Segoe UI Symbol"/>
-        </w:rPr>
-        <w:t xml:space="preserve">☐  </w:t>
+          <w:rFonts w:ascii="Segoe UI Symbol" w:hAnsi="Segoe UI Symbol" w:cs="Segoe UI Symbol"/>
+          <w:color w:val="E6E8F0"/>
+          <w:shd w:val="clear" w:color="auto" w:fill="1F1F1F"/>
+        </w:rPr>
+        <w:t>✓</w:t>
+      </w:r>
+      <w:r>
+        <w:rPr>
+          <w:rFonts w:ascii="Segoe UI Symbol" w:eastAsia="Segoe UI Symbol" w:hAnsi="Segoe UI Symbol" w:cs="Segoe UI Symbol"/>
+        </w:rPr>
+        <w:t xml:space="preserve">  </w:t>
       </w:r>
       <w:r>
         <w:t>Box</w:t>
@@ -3557,9 +4002,17 @@
       <w:proofErr w:type="gramStart"/>
       <w:r>
         <w:rPr>
-          <w:rFonts w:ascii="Segoe UI Symbol" w:eastAsia="Segoe UI Symbol" w:hAnsi="Segoe UI Symbol" w:cs="Segoe UI Symbol"/>
-        </w:rPr>
-        <w:t xml:space="preserve">☐  </w:t>
+          <w:rFonts w:ascii="Segoe UI Symbol" w:hAnsi="Segoe UI Symbol" w:cs="Segoe UI Symbol"/>
+          <w:color w:val="E6E8F0"/>
+          <w:shd w:val="clear" w:color="auto" w:fill="1F1F1F"/>
+        </w:rPr>
+        <w:t>✓</w:t>
+      </w:r>
+      <w:r>
+        <w:rPr>
+          <w:rFonts w:ascii="Segoe UI Symbol" w:eastAsia="Segoe UI Symbol" w:hAnsi="Segoe UI Symbol" w:cs="Segoe UI Symbol"/>
+        </w:rPr>
+        <w:t xml:space="preserve">  </w:t>
       </w:r>
       <w:r>
         <w:t>Heatmap</w:t>
@@ -3577,9 +4030,17 @@
       <w:proofErr w:type="gramStart"/>
       <w:r>
         <w:rPr>
-          <w:rFonts w:ascii="Segoe UI Symbol" w:eastAsia="Segoe UI Symbol" w:hAnsi="Segoe UI Symbol" w:cs="Segoe UI Symbol"/>
-        </w:rPr>
-        <w:t xml:space="preserve">☐  </w:t>
+          <w:rFonts w:ascii="Segoe UI Symbol" w:hAnsi="Segoe UI Symbol" w:cs="Segoe UI Symbol"/>
+          <w:color w:val="E6E8F0"/>
+          <w:shd w:val="clear" w:color="auto" w:fill="1F1F1F"/>
+        </w:rPr>
+        <w:t>✓</w:t>
+      </w:r>
+      <w:r>
+        <w:rPr>
+          <w:rFonts w:ascii="Segoe UI Symbol" w:eastAsia="Segoe UI Symbol" w:hAnsi="Segoe UI Symbol" w:cs="Segoe UI Symbol"/>
+        </w:rPr>
+        <w:t xml:space="preserve">  </w:t>
       </w:r>
       <w:r>
         <w:t>Optional</w:t>
@@ -3629,9 +4090,17 @@
       <w:proofErr w:type="gramStart"/>
       <w:r>
         <w:rPr>
-          <w:rFonts w:ascii="Segoe UI Symbol" w:eastAsia="Segoe UI Symbol" w:hAnsi="Segoe UI Symbol" w:cs="Segoe UI Symbol"/>
-        </w:rPr>
-        <w:t xml:space="preserve">☐  </w:t>
+          <w:rFonts w:ascii="Segoe UI Symbol" w:hAnsi="Segoe UI Symbol" w:cs="Segoe UI Symbol"/>
+          <w:color w:val="E6E8F0"/>
+          <w:shd w:val="clear" w:color="auto" w:fill="1F1F1F"/>
+        </w:rPr>
+        <w:t>✓</w:t>
+      </w:r>
+      <w:r>
+        <w:rPr>
+          <w:rFonts w:ascii="Segoe UI Symbol" w:eastAsia="Segoe UI Symbol" w:hAnsi="Segoe UI Symbol" w:cs="Segoe UI Symbol"/>
+        </w:rPr>
+        <w:t xml:space="preserve">  </w:t>
       </w:r>
       <w:r>
         <w:t>Introduction</w:t>
@@ -3649,9 +4118,17 @@
       <w:proofErr w:type="gramStart"/>
       <w:r>
         <w:rPr>
-          <w:rFonts w:ascii="Segoe UI Symbol" w:eastAsia="Segoe UI Symbol" w:hAnsi="Segoe UI Symbol" w:cs="Segoe UI Symbol"/>
-        </w:rPr>
-        <w:t xml:space="preserve">☐  </w:t>
+          <w:rFonts w:ascii="Segoe UI Symbol" w:hAnsi="Segoe UI Symbol" w:cs="Segoe UI Symbol"/>
+          <w:color w:val="E6E8F0"/>
+          <w:shd w:val="clear" w:color="auto" w:fill="1F1F1F"/>
+        </w:rPr>
+        <w:t>✓</w:t>
+      </w:r>
+      <w:r>
+        <w:rPr>
+          <w:rFonts w:ascii="Segoe UI Symbol" w:eastAsia="Segoe UI Symbol" w:hAnsi="Segoe UI Symbol" w:cs="Segoe UI Symbol"/>
+        </w:rPr>
+        <w:t xml:space="preserve">  </w:t>
       </w:r>
       <w:r>
         <w:t>Data</w:t>
@@ -3669,9 +4146,17 @@
       <w:proofErr w:type="gramStart"/>
       <w:r>
         <w:rPr>
-          <w:rFonts w:ascii="Segoe UI Symbol" w:eastAsia="Segoe UI Symbol" w:hAnsi="Segoe UI Symbol" w:cs="Segoe UI Symbol"/>
-        </w:rPr>
-        <w:t xml:space="preserve">☐  </w:t>
+          <w:rFonts w:ascii="Segoe UI Symbol" w:hAnsi="Segoe UI Symbol" w:cs="Segoe UI Symbol"/>
+          <w:color w:val="E6E8F0"/>
+          <w:shd w:val="clear" w:color="auto" w:fill="1F1F1F"/>
+        </w:rPr>
+        <w:t>✓</w:t>
+      </w:r>
+      <w:r>
+        <w:rPr>
+          <w:rFonts w:ascii="Segoe UI Symbol" w:eastAsia="Segoe UI Symbol" w:hAnsi="Segoe UI Symbol" w:cs="Segoe UI Symbol"/>
+        </w:rPr>
+        <w:t xml:space="preserve">  </w:t>
       </w:r>
       <w:r>
         <w:t>Experimental</w:t>
@@ -3689,9 +4174,17 @@
       <w:proofErr w:type="gramStart"/>
       <w:r>
         <w:rPr>
-          <w:rFonts w:ascii="Segoe UI Symbol" w:eastAsia="Segoe UI Symbol" w:hAnsi="Segoe UI Symbol" w:cs="Segoe UI Symbol"/>
-        </w:rPr>
-        <w:t xml:space="preserve">☐  </w:t>
+          <w:rFonts w:ascii="Segoe UI Symbol" w:hAnsi="Segoe UI Symbol" w:cs="Segoe UI Symbol"/>
+          <w:color w:val="E6E8F0"/>
+          <w:shd w:val="clear" w:color="auto" w:fill="1F1F1F"/>
+        </w:rPr>
+        <w:t>✓</w:t>
+      </w:r>
+      <w:r>
+        <w:rPr>
+          <w:rFonts w:ascii="Segoe UI Symbol" w:eastAsia="Segoe UI Symbol" w:hAnsi="Segoe UI Symbol" w:cs="Segoe UI Symbol"/>
+        </w:rPr>
+        <w:t xml:space="preserve">  </w:t>
       </w:r>
       <w:r>
         <w:t>Results</w:t>
@@ -3709,9 +4202,17 @@
       <w:proofErr w:type="gramStart"/>
       <w:r>
         <w:rPr>
-          <w:rFonts w:ascii="Segoe UI Symbol" w:eastAsia="Segoe UI Symbol" w:hAnsi="Segoe UI Symbol" w:cs="Segoe UI Symbol"/>
-        </w:rPr>
-        <w:t xml:space="preserve">☐  </w:t>
+          <w:rFonts w:ascii="Segoe UI Symbol" w:hAnsi="Segoe UI Symbol" w:cs="Segoe UI Symbol"/>
+          <w:color w:val="E6E8F0"/>
+          <w:shd w:val="clear" w:color="auto" w:fill="1F1F1F"/>
+        </w:rPr>
+        <w:t>✓</w:t>
+      </w:r>
+      <w:r>
+        <w:rPr>
+          <w:rFonts w:ascii="Segoe UI Symbol" w:eastAsia="Segoe UI Symbol" w:hAnsi="Segoe UI Symbol" w:cs="Segoe UI Symbol"/>
+        </w:rPr>
+        <w:t xml:space="preserve">  </w:t>
       </w:r>
       <w:r>
         <w:t>Discussion</w:t>
@@ -3737,9 +4238,17 @@
       <w:proofErr w:type="gramStart"/>
       <w:r>
         <w:rPr>
-          <w:rFonts w:ascii="Segoe UI Symbol" w:eastAsia="Segoe UI Symbol" w:hAnsi="Segoe UI Symbol" w:cs="Segoe UI Symbol"/>
-        </w:rPr>
-        <w:t xml:space="preserve">☐  </w:t>
+          <w:rFonts w:ascii="Segoe UI Symbol" w:hAnsi="Segoe UI Symbol" w:cs="Segoe UI Symbol"/>
+          <w:color w:val="E6E8F0"/>
+          <w:shd w:val="clear" w:color="auto" w:fill="1F1F1F"/>
+        </w:rPr>
+        <w:t>✓</w:t>
+      </w:r>
+      <w:r>
+        <w:rPr>
+          <w:rFonts w:ascii="Segoe UI Symbol" w:eastAsia="Segoe UI Symbol" w:hAnsi="Segoe UI Symbol" w:cs="Segoe UI Symbol"/>
+        </w:rPr>
+        <w:t xml:space="preserve">  </w:t>
       </w:r>
       <w:r>
         <w:t>Limitations</w:t>
@@ -3757,9 +4266,17 @@
       <w:proofErr w:type="gramStart"/>
       <w:r>
         <w:rPr>
-          <w:rFonts w:ascii="Segoe UI Symbol" w:eastAsia="Segoe UI Symbol" w:hAnsi="Segoe UI Symbol" w:cs="Segoe UI Symbol"/>
-        </w:rPr>
-        <w:t xml:space="preserve">☐  </w:t>
+          <w:rFonts w:ascii="Segoe UI Symbol" w:hAnsi="Segoe UI Symbol" w:cs="Segoe UI Symbol"/>
+          <w:color w:val="E6E8F0"/>
+          <w:shd w:val="clear" w:color="auto" w:fill="1F1F1F"/>
+        </w:rPr>
+        <w:t>✓</w:t>
+      </w:r>
+      <w:r>
+        <w:rPr>
+          <w:rFonts w:ascii="Segoe UI Symbol" w:eastAsia="Segoe UI Symbol" w:hAnsi="Segoe UI Symbol" w:cs="Segoe UI Symbol"/>
+        </w:rPr>
+        <w:t xml:space="preserve">  </w:t>
       </w:r>
       <w:r>
         <w:t>Conclusion</w:t>
@@ -3777,9 +4294,17 @@
       <w:proofErr w:type="gramStart"/>
       <w:r>
         <w:rPr>
-          <w:rFonts w:ascii="Segoe UI Symbol" w:eastAsia="Segoe UI Symbol" w:hAnsi="Segoe UI Symbol" w:cs="Segoe UI Symbol"/>
-        </w:rPr>
-        <w:t xml:space="preserve">☐  </w:t>
+          <w:rFonts w:ascii="Segoe UI Symbol" w:hAnsi="Segoe UI Symbol" w:cs="Segoe UI Symbol"/>
+          <w:color w:val="E6E8F0"/>
+          <w:shd w:val="clear" w:color="auto" w:fill="1F1F1F"/>
+        </w:rPr>
+        <w:t>✓</w:t>
+      </w:r>
+      <w:r>
+        <w:rPr>
+          <w:rFonts w:ascii="Segoe UI Symbol" w:eastAsia="Segoe UI Symbol" w:hAnsi="Segoe UI Symbol" w:cs="Segoe UI Symbol"/>
+        </w:rPr>
+        <w:t xml:space="preserve">  </w:t>
       </w:r>
       <w:r>
         <w:t>Prepare</w:t>
@@ -3797,9 +4322,17 @@
       <w:proofErr w:type="gramStart"/>
       <w:r>
         <w:rPr>
-          <w:rFonts w:ascii="Segoe UI Symbol" w:eastAsia="Segoe UI Symbol" w:hAnsi="Segoe UI Symbol" w:cs="Segoe UI Symbol"/>
-        </w:rPr>
-        <w:t xml:space="preserve">☐  </w:t>
+          <w:rFonts w:ascii="Segoe UI Symbol" w:hAnsi="Segoe UI Symbol" w:cs="Segoe UI Symbol"/>
+          <w:color w:val="E6E8F0"/>
+          <w:shd w:val="clear" w:color="auto" w:fill="1F1F1F"/>
+        </w:rPr>
+        <w:t>✓</w:t>
+      </w:r>
+      <w:r>
+        <w:rPr>
+          <w:rFonts w:ascii="Segoe UI Symbol" w:eastAsia="Segoe UI Symbol" w:hAnsi="Segoe UI Symbol" w:cs="Segoe UI Symbol"/>
+        </w:rPr>
+        <w:t xml:space="preserve">  </w:t>
       </w:r>
       <w:r>
         <w:t>Finalize</w:t>
@@ -3817,9 +4350,17 @@
       <w:proofErr w:type="gramStart"/>
       <w:r>
         <w:rPr>
-          <w:rFonts w:ascii="Segoe UI Symbol" w:eastAsia="Segoe UI Symbol" w:hAnsi="Segoe UI Symbol" w:cs="Segoe UI Symbol"/>
-        </w:rPr>
-        <w:t xml:space="preserve">☐  </w:t>
+          <w:rFonts w:ascii="Segoe UI Symbol" w:hAnsi="Segoe UI Symbol" w:cs="Segoe UI Symbol"/>
+          <w:color w:val="E6E8F0"/>
+          <w:shd w:val="clear" w:color="auto" w:fill="1F1F1F"/>
+        </w:rPr>
+        <w:t>✓</w:t>
+      </w:r>
+      <w:r>
+        <w:rPr>
+          <w:rFonts w:ascii="Segoe UI Symbol" w:eastAsia="Segoe UI Symbol" w:hAnsi="Segoe UI Symbol" w:cs="Segoe UI Symbol"/>
+        </w:rPr>
+        <w:t xml:space="preserve">  </w:t>
       </w:r>
       <w:r>
         <w:t>Clean</w:t>
@@ -3886,12 +4427,6 @@
         <w:gridCol w:w="3580"/>
       </w:tblGrid>
       <w:tr>
-        <w:tblPrEx>
-          <w:tblCellMar>
-            <w:top w:w="0" w:type="dxa"/>
-            <w:bottom w:w="0" w:type="dxa"/>
-          </w:tblCellMar>
-        </w:tblPrEx>
         <w:tc>
           <w:tcPr>
             <w:tcW w:w="2200" w:type="dxa"/>
@@ -3984,12 +4519,6 @@
         </w:tc>
       </w:tr>
       <w:tr>
-        <w:tblPrEx>
-          <w:tblCellMar>
-            <w:top w:w="0" w:type="dxa"/>
-            <w:bottom w:w="0" w:type="dxa"/>
-          </w:tblCellMar>
-        </w:tblPrEx>
         <w:tc>
           <w:tcPr>
             <w:tcW w:w="2200" w:type="dxa"/>
@@ -4098,12 +4627,6 @@
         </w:tc>
       </w:tr>
       <w:tr>
-        <w:tblPrEx>
-          <w:tblCellMar>
-            <w:top w:w="0" w:type="dxa"/>
-            <w:bottom w:w="0" w:type="dxa"/>
-          </w:tblCellMar>
-        </w:tblPrEx>
         <w:tc>
           <w:tcPr>
             <w:tcW w:w="2200" w:type="dxa"/>
@@ -4195,12 +4718,6 @@
         </w:tc>
       </w:tr>
       <w:tr>
-        <w:tblPrEx>
-          <w:tblCellMar>
-            <w:top w:w="0" w:type="dxa"/>
-            <w:bottom w:w="0" w:type="dxa"/>
-          </w:tblCellMar>
-        </w:tblPrEx>
         <w:tc>
           <w:tcPr>
             <w:tcW w:w="2200" w:type="dxa"/>
@@ -4285,12 +4802,6 @@
         </w:tc>
       </w:tr>
       <w:tr>
-        <w:tblPrEx>
-          <w:tblCellMar>
-            <w:top w:w="0" w:type="dxa"/>
-            <w:bottom w:w="0" w:type="dxa"/>
-          </w:tblCellMar>
-        </w:tblPrEx>
         <w:tc>
           <w:tcPr>
             <w:tcW w:w="2200" w:type="dxa"/>
@@ -4390,12 +4901,6 @@
         </w:tc>
       </w:tr>
       <w:tr>
-        <w:tblPrEx>
-          <w:tblCellMar>
-            <w:top w:w="0" w:type="dxa"/>
-            <w:bottom w:w="0" w:type="dxa"/>
-          </w:tblCellMar>
-        </w:tblPrEx>
         <w:tc>
           <w:tcPr>
             <w:tcW w:w="2200" w:type="dxa"/>
@@ -4540,9 +5045,17 @@
       <w:proofErr w:type="gramStart"/>
       <w:r>
         <w:rPr>
-          <w:rFonts w:ascii="Segoe UI Symbol" w:eastAsia="Segoe UI Symbol" w:hAnsi="Segoe UI Symbol" w:cs="Segoe UI Symbol"/>
-        </w:rPr>
-        <w:t xml:space="preserve">☐  </w:t>
+          <w:rFonts w:ascii="Segoe UI Symbol" w:hAnsi="Segoe UI Symbol" w:cs="Segoe UI Symbol"/>
+          <w:color w:val="E6E8F0"/>
+          <w:shd w:val="clear" w:color="auto" w:fill="1F1F1F"/>
+        </w:rPr>
+        <w:t>✓</w:t>
+      </w:r>
+      <w:r>
+        <w:rPr>
+          <w:rFonts w:ascii="Segoe UI Symbol" w:eastAsia="Segoe UI Symbol" w:hAnsi="Segoe UI Symbol" w:cs="Segoe UI Symbol"/>
+        </w:rPr>
+        <w:t xml:space="preserve">  </w:t>
       </w:r>
       <w:proofErr w:type="spellStart"/>
       <w:r>
@@ -4580,9 +5093,17 @@
       <w:proofErr w:type="gramStart"/>
       <w:r>
         <w:rPr>
-          <w:rFonts w:ascii="Segoe UI Symbol" w:eastAsia="Segoe UI Symbol" w:hAnsi="Segoe UI Symbol" w:cs="Segoe UI Symbol"/>
-        </w:rPr>
-        <w:t xml:space="preserve">☐  </w:t>
+          <w:rFonts w:ascii="Segoe UI Symbol" w:hAnsi="Segoe UI Symbol" w:cs="Segoe UI Symbol"/>
+          <w:color w:val="E6E8F0"/>
+          <w:shd w:val="clear" w:color="auto" w:fill="1F1F1F"/>
+        </w:rPr>
+        <w:t>✓</w:t>
+      </w:r>
+      <w:r>
+        <w:rPr>
+          <w:rFonts w:ascii="Segoe UI Symbol" w:eastAsia="Segoe UI Symbol" w:hAnsi="Segoe UI Symbol" w:cs="Segoe UI Symbol"/>
+        </w:rPr>
+        <w:t xml:space="preserve">  </w:t>
       </w:r>
       <w:r>
         <w:rPr>
@@ -4604,9 +5125,17 @@
       <w:proofErr w:type="gramStart"/>
       <w:r>
         <w:rPr>
-          <w:rFonts w:ascii="Segoe UI Symbol" w:eastAsia="Segoe UI Symbol" w:hAnsi="Segoe UI Symbol" w:cs="Segoe UI Symbol"/>
-        </w:rPr>
-        <w:t xml:space="preserve">☐  </w:t>
+          <w:rFonts w:ascii="Segoe UI Symbol" w:hAnsi="Segoe UI Symbol" w:cs="Segoe UI Symbol"/>
+          <w:color w:val="E6E8F0"/>
+          <w:shd w:val="clear" w:color="auto" w:fill="1F1F1F"/>
+        </w:rPr>
+        <w:t>✓</w:t>
+      </w:r>
+      <w:r>
+        <w:rPr>
+          <w:rFonts w:ascii="Segoe UI Symbol" w:eastAsia="Segoe UI Symbol" w:hAnsi="Segoe UI Symbol" w:cs="Segoe UI Symbol"/>
+        </w:rPr>
+        <w:t xml:space="preserve">  </w:t>
       </w:r>
       <w:r>
         <w:rPr>
@@ -4625,12 +5154,20 @@
         <w:spacing w:before="60" w:after="60"/>
         <w:ind w:left="360"/>
       </w:pPr>
-      <w:proofErr w:type="gramStart"/>
-      <w:r>
-        <w:rPr>
-          <w:rFonts w:ascii="Segoe UI Symbol" w:eastAsia="Segoe UI Symbol" w:hAnsi="Segoe UI Symbol" w:cs="Segoe UI Symbol"/>
-        </w:rPr>
-        <w:t xml:space="preserve">☐  </w:t>
+      <w:r>
+        <w:rPr>
+          <w:rFonts w:ascii="Segoe UI Symbol" w:hAnsi="Segoe UI Symbol" w:cs="Segoe UI Symbol"/>
+          <w:color w:val="E6E8F0"/>
+          <w:shd w:val="clear" w:color="auto" w:fill="1F1F1F"/>
+        </w:rPr>
+        <w:t>✓</w:t>
+      </w:r>
+      <w:proofErr w:type="gramStart"/>
+      <w:r>
+        <w:rPr>
+          <w:rFonts w:ascii="Segoe UI Symbol" w:eastAsia="Segoe UI Symbol" w:hAnsi="Segoe UI Symbol" w:cs="Segoe UI Symbol"/>
+        </w:rPr>
+        <w:t xml:space="preserve">  </w:t>
       </w:r>
       <w:r>
         <w:rPr>
@@ -4649,12 +5186,20 @@
         <w:spacing w:before="60" w:after="60"/>
         <w:ind w:left="360"/>
       </w:pPr>
-      <w:proofErr w:type="gramStart"/>
-      <w:r>
-        <w:rPr>
-          <w:rFonts w:ascii="Segoe UI Symbol" w:eastAsia="Segoe UI Symbol" w:hAnsi="Segoe UI Symbol" w:cs="Segoe UI Symbol"/>
-        </w:rPr>
-        <w:t xml:space="preserve">☐  </w:t>
+      <w:r>
+        <w:rPr>
+          <w:rFonts w:ascii="Segoe UI Symbol" w:hAnsi="Segoe UI Symbol" w:cs="Segoe UI Symbol"/>
+          <w:color w:val="E6E8F0"/>
+          <w:shd w:val="clear" w:color="auto" w:fill="1F1F1F"/>
+        </w:rPr>
+        <w:t>✓</w:t>
+      </w:r>
+      <w:proofErr w:type="gramStart"/>
+      <w:r>
+        <w:rPr>
+          <w:rFonts w:ascii="Segoe UI Symbol" w:eastAsia="Segoe UI Symbol" w:hAnsi="Segoe UI Symbol" w:cs="Segoe UI Symbol"/>
+        </w:rPr>
+        <w:t xml:space="preserve">  </w:t>
       </w:r>
       <w:r>
         <w:rPr>
@@ -4673,12 +5218,20 @@
         <w:spacing w:before="60" w:after="60"/>
         <w:ind w:left="360"/>
       </w:pPr>
-      <w:proofErr w:type="gramStart"/>
-      <w:r>
-        <w:rPr>
-          <w:rFonts w:ascii="Segoe UI Symbol" w:eastAsia="Segoe UI Symbol" w:hAnsi="Segoe UI Symbol" w:cs="Segoe UI Symbol"/>
-        </w:rPr>
-        <w:t xml:space="preserve">☐  </w:t>
+      <w:r>
+        <w:rPr>
+          <w:rFonts w:ascii="Segoe UI Symbol" w:hAnsi="Segoe UI Symbol" w:cs="Segoe UI Symbol"/>
+          <w:color w:val="E6E8F0"/>
+          <w:shd w:val="clear" w:color="auto" w:fill="1F1F1F"/>
+        </w:rPr>
+        <w:t>✓</w:t>
+      </w:r>
+      <w:proofErr w:type="gramStart"/>
+      <w:r>
+        <w:rPr>
+          <w:rFonts w:ascii="Segoe UI Symbol" w:eastAsia="Segoe UI Symbol" w:hAnsi="Segoe UI Symbol" w:cs="Segoe UI Symbol"/>
+        </w:rPr>
+        <w:t xml:space="preserve">  </w:t>
       </w:r>
       <w:r>
         <w:rPr>
@@ -4704,12 +5257,20 @@
         <w:spacing w:before="60" w:after="60"/>
         <w:ind w:left="360"/>
       </w:pPr>
-      <w:proofErr w:type="gramStart"/>
-      <w:r>
-        <w:rPr>
-          <w:rFonts w:ascii="Segoe UI Symbol" w:eastAsia="Segoe UI Symbol" w:hAnsi="Segoe UI Symbol" w:cs="Segoe UI Symbol"/>
-        </w:rPr>
-        <w:t xml:space="preserve">☐  </w:t>
+      <w:r>
+        <w:rPr>
+          <w:rFonts w:ascii="Segoe UI Symbol" w:hAnsi="Segoe UI Symbol" w:cs="Segoe UI Symbol"/>
+          <w:color w:val="E6E8F0"/>
+          <w:shd w:val="clear" w:color="auto" w:fill="1F1F1F"/>
+        </w:rPr>
+        <w:t>✓</w:t>
+      </w:r>
+      <w:proofErr w:type="gramStart"/>
+      <w:r>
+        <w:rPr>
+          <w:rFonts w:ascii="Segoe UI Symbol" w:eastAsia="Segoe UI Symbol" w:hAnsi="Segoe UI Symbol" w:cs="Segoe UI Symbol"/>
+        </w:rPr>
+        <w:t xml:space="preserve">  </w:t>
       </w:r>
       <w:r>
         <w:rPr>
@@ -4735,12 +5296,20 @@
         <w:spacing w:before="60" w:after="60"/>
         <w:ind w:left="360"/>
       </w:pPr>
-      <w:proofErr w:type="gramStart"/>
-      <w:r>
-        <w:rPr>
-          <w:rFonts w:ascii="Segoe UI Symbol" w:eastAsia="Segoe UI Symbol" w:hAnsi="Segoe UI Symbol" w:cs="Segoe UI Symbol"/>
-        </w:rPr>
-        <w:t xml:space="preserve">☐  </w:t>
+      <w:r>
+        <w:rPr>
+          <w:rFonts w:ascii="Segoe UI Symbol" w:hAnsi="Segoe UI Symbol" w:cs="Segoe UI Symbol"/>
+          <w:color w:val="E6E8F0"/>
+          <w:shd w:val="clear" w:color="auto" w:fill="1F1F1F"/>
+        </w:rPr>
+        <w:t>✓</w:t>
+      </w:r>
+      <w:proofErr w:type="gramStart"/>
+      <w:r>
+        <w:rPr>
+          <w:rFonts w:ascii="Segoe UI Symbol" w:eastAsia="Segoe UI Symbol" w:hAnsi="Segoe UI Symbol" w:cs="Segoe UI Symbol"/>
+        </w:rPr>
+        <w:t xml:space="preserve">  </w:t>
       </w:r>
       <w:r>
         <w:rPr>

</xml_diff>